<commit_message>
Instagram captions article: add B2B voice, caption ideas, ad disclosure FAQ after competitor audit
Co-Authored-By: Claude Opus 5.5 <noreply@anthropic.com>
Claude-Session: https://claude.ai/code/session_01GQXcnZLn4f9MkUS7SEqp5J
</commit_message>
<xml_diff>
--- a/blog-content/How-to-Write-Instagram-Captions-for-Business.docx
+++ b/blog-content/How-to-Write-Instagram-Captions-for-Business.docx
@@ -153,7 +153,7 @@
         </w:rPr>
         <w:t xml:space="preserve">This guide gives you a simple method you can use for every post, templates for each business goal, examples for different types of business, and a way to check whether your captions are working. If you're new to social media marketing as a whole, start with our </w:t>
       </w:r>
-      <w:hyperlink w:history="1" r:id="rIdxrjavg5dssjrq6_2xhgbn">
+      <w:hyperlink w:history="1" r:id="rId5vq-zogor8hguasvhquzp">
         <w:r>
           <w:rPr>
             <w:rStyle w:val="Hyperlink"/>
@@ -475,6 +475,20 @@
     </w:p>
     <w:p>
       <w:pPr>
+        <w:spacing w:after="160"/>
+      </w:pPr>
+      <w:r>
+        <w:rPr>
+          <w:rFonts w:ascii="Calibri" w:cs="Calibri" w:eastAsia="Calibri" w:hAnsi="Calibri"/>
+          <w:color w:val="333333"/>
+          <w:sz w:val="24"/>
+          <w:szCs w:val="24"/>
+        </w:rPr>
+        <w:t xml:space="preserve">Voice also depends on who you sell to. A B2B firm selling to other businesses can be more formal and data-led; a local shop or consumer brand can be more casual. Both should still sound like people, not press releases.</w:t>
+      </w:r>
+    </w:p>
+    <w:p>
+      <w:pPr>
         <w:pStyle w:val="Heading3"/>
         <w:spacing w:after="80" w:before="200"/>
       </w:pPr>
@@ -1201,7 +1215,7 @@
         </w:rPr>
         <w:t xml:space="preserve"> Instagram now limits posts and Reels to </w:t>
       </w:r>
-      <w:hyperlink w:history="1" r:id="rIdrtckqdzpggpj1pb3vt-gw">
+      <w:hyperlink w:history="1" r:id="rIdwt17nsuzp4rvslhtcowzl">
         <w:r>
           <w:rPr>
             <w:rStyle w:val="Hyperlink"/>
@@ -1223,7 +1237,7 @@
         </w:rPr>
         <w:t xml:space="preserve">, so pick ones that describe the post accurately. Our </w:t>
       </w:r>
-      <w:hyperlink w:history="1" r:id="rIdgtoid4bdg4nwhvz89axpz">
+      <w:hyperlink w:history="1" r:id="rIdqxm_yv2_pze17eyiwbkv-">
         <w:r>
           <w:rPr>
             <w:rStyle w:val="Hyperlink"/>
@@ -1647,7 +1661,7 @@
         </w:rPr>
         <w:t xml:space="preserve">As long as the post needs, up to Instagram's limit of 2,200 characters, which Meta lists in its </w:t>
       </w:r>
-      <w:hyperlink w:history="1" r:id="rIdoayxu74oyz1wgyofl91rn">
+      <w:hyperlink w:history="1" r:id="rIdmlgnio2ncjmqldkdjhgif">
         <w:r>
           <w:rPr>
             <w:rStyle w:val="Hyperlink"/>
@@ -2678,7 +2692,7 @@
         </w:rPr>
         <w:t xml:space="preserve">Use the words your customers type when they search. Instagram says its search tries to match what people type with usernames, bios, captions, hashtags and places, as </w:t>
       </w:r>
-      <w:hyperlink w:history="1" r:id="rIdvlqdf7jmb4bdwqjusivgz">
+      <w:hyperlink w:history="1" r:id="rId0cf8rginbabrljp_743kv">
         <w:r>
           <w:rPr>
             <w:rStyle w:val="Hyperlink"/>
@@ -2714,7 +2728,7 @@
         </w:rPr>
         <w:t xml:space="preserve">Captions can also reach people outside the app. Since July 2025, public posts from Instagram business and creator accounts can appear in Google and Bing results, </w:t>
       </w:r>
-      <w:hyperlink w:history="1" r:id="rIdlkvgwrh2pqnitd9w_jypp">
+      <w:hyperlink w:history="1" r:id="rIdb9p0ryhmpzxwgvdyrwn5e">
         <w:r>
           <w:rPr>
             <w:rStyle w:val="Hyperlink"/>
@@ -2837,7 +2851,7 @@
         </w:rPr>
         <w:t xml:space="preserve"> for images. Instagram lets you add your own description in the post's advanced settings before or after posting, as its </w:t>
       </w:r>
-      <w:hyperlink w:history="1" r:id="rIdoexvzmfjwo5oxq3fpdcda">
+      <w:hyperlink w:history="1" r:id="rIde9phuotomz-zs3nevjdms">
         <w:r>
           <w:rPr>
             <w:rStyle w:val="Hyperlink"/>
@@ -2966,16 +2980,16 @@
           <w:sz w:val="24"/>
           <w:szCs w:val="24"/>
         </w:rPr>
-        <w:t xml:space="preserve">Turn one idea into three posts.</w:t>
-      </w:r>
-      <w:r>
-        <w:rPr>
-          <w:rFonts w:ascii="Calibri" w:cs="Calibri" w:eastAsia="Calibri" w:hAnsi="Calibri"/>
-          <w:color w:val="333333"/>
-          <w:sz w:val="24"/>
-          <w:szCs w:val="24"/>
-        </w:rPr>
-        <w:t xml:space="preserve"> A tip can be a carousel, a short Reel and a story-based caption from your own experience.</w:t>
+        <w:t xml:space="preserve">Use a set of caption ideas when you're stuck.</w:t>
+      </w:r>
+      <w:r>
+        <w:rPr>
+          <w:rFonts w:ascii="Calibri" w:cs="Calibri" w:eastAsia="Calibri" w:hAnsi="Calibri"/>
+          <w:color w:val="333333"/>
+          <w:sz w:val="24"/>
+          <w:szCs w:val="24"/>
+        </w:rPr>
+        <w:t xml:space="preserve"> Behind the scenes, how a product is made, a customer's question answered, a common myth corrected, a team member introduced, a seasonal or local event, a before-and-after, or a customer's own photo reshared with their permission and credit.</w:t>
       </w:r>
     </w:p>
     <w:p>
@@ -2995,6 +3009,35 @@
           <w:sz w:val="24"/>
           <w:szCs w:val="24"/>
         </w:rPr>
+        <w:t xml:space="preserve">Turn one idea into three posts.</w:t>
+      </w:r>
+      <w:r>
+        <w:rPr>
+          <w:rFonts w:ascii="Calibri" w:cs="Calibri" w:eastAsia="Calibri" w:hAnsi="Calibri"/>
+          <w:color w:val="333333"/>
+          <w:sz w:val="24"/>
+          <w:szCs w:val="24"/>
+        </w:rPr>
+        <w:t xml:space="preserve"> A tip can be a carousel, a short Reel and a story-based caption from your own experience.</w:t>
+      </w:r>
+    </w:p>
+    <w:p>
+      <w:pPr>
+        <w:pStyle w:val="ListParagraph"/>
+        <w:numPr>
+          <w:ilvl w:val="0"/>
+          <w:numId w:val="1"/>
+        </w:numPr>
+      </w:pPr>
+      <w:r>
+        <w:rPr>
+          <w:rFonts w:ascii="Calibri" w:cs="Calibri" w:eastAsia="Calibri" w:hAnsi="Calibri"/>
+          <w:b/>
+          <w:bCs/>
+          <w:color w:val="333333"/>
+          <w:sz w:val="24"/>
+          <w:szCs w:val="24"/>
+        </w:rPr>
         <w:t xml:space="preserve">Use AI for the first draft, not the final one.</w:t>
       </w:r>
       <w:r>
@@ -3006,7 +3049,7 @@
         </w:rPr>
         <w:t xml:space="preserve"> AI is useful when you're stuck on a hook or need five versions of a call to action. Our free </w:t>
       </w:r>
-      <w:hyperlink w:history="1" r:id="rIdcbixg5oxoi0nwvotf6le2">
+      <w:hyperlink w:history="1" r:id="rIdxsbur1ttkisg7jjz8w915">
         <w:r>
           <w:rPr>
             <w:rStyle w:val="Hyperlink"/>
@@ -3028,7 +3071,7 @@
         </w:rPr>
         <w:t xml:space="preserve"> gives you drafts to start from. Then add the details only you know: your prices, your customers' words, your real results. The editing steps in </w:t>
       </w:r>
-      <w:hyperlink w:history="1" r:id="rId4b2--8thd5scsf8m9unjk">
+      <w:hyperlink w:history="1" r:id="rIdxts32hqcf0hr0gzuwib_x">
         <w:r>
           <w:rPr>
             <w:rStyle w:val="Hyperlink"/>
@@ -3460,6 +3503,81 @@
           <w:szCs w:val="24"/>
         </w:rPr>
         <w:t xml:space="preserve">Yes, for a strong image or a well-known brand, a one-word caption can work. For most small businesses it wastes the chance to explain, invite a comment or point people to the next step. Save very short captions for posts where the picture says everything.</w:t>
+      </w:r>
+    </w:p>
+    <w:p>
+      <w:pPr>
+        <w:pStyle w:val="Heading3"/>
+        <w:spacing w:after="80" w:before="200"/>
+      </w:pPr>
+      <w:r>
+        <w:rPr>
+          <w:rFonts w:ascii="Calibri" w:cs="Calibri" w:eastAsia="Calibri" w:hAnsi="Calibri"/>
+          <w:b/>
+          <w:bCs/>
+          <w:color w:val="333333"/>
+          <w:sz w:val="28"/>
+          <w:szCs w:val="28"/>
+        </w:rPr>
+        <w:t xml:space="preserve">Do you need to label sponsored or gifted posts?</w:t>
+      </w:r>
+    </w:p>
+    <w:p>
+      <w:pPr>
+        <w:spacing w:after="160"/>
+      </w:pPr>
+      <w:r>
+        <w:rPr>
+          <w:rFonts w:ascii="Calibri" w:cs="Calibri" w:eastAsia="Calibri" w:hAnsi="Calibri"/>
+          <w:color w:val="333333"/>
+          <w:sz w:val="24"/>
+          <w:szCs w:val="24"/>
+        </w:rPr>
+        <w:t xml:space="preserve">Yes, if a post promotes something you were paid for, gifted or have a business link to, it must be clearly labelled as an ad. In the UK, the ASA and CMA's </w:t>
+      </w:r>
+      <w:hyperlink w:history="1" r:id="rId70vjq_1ykof6jkngvtgdv">
+        <w:r>
+          <w:rPr>
+            <w:rStyle w:val="Hyperlink"/>
+            <w:rFonts w:ascii="Calibri" w:cs="Calibri" w:eastAsia="Calibri" w:hAnsi="Calibri"/>
+            <w:color w:val="0563C1"/>
+            <w:sz w:val="24"/>
+            <w:szCs w:val="24"/>
+            <w:u w:val="single"/>
+          </w:rPr>
+          <w:t xml:space="preserve">influencer guidance</w:t>
+        </w:r>
+      </w:hyperlink>
+      <w:r>
+        <w:rPr>
+          <w:rFonts w:ascii="Calibri" w:cs="Calibri" w:eastAsia="Calibri" w:hAnsi="Calibri"/>
+          <w:color w:val="333333"/>
+          <w:sz w:val="24"/>
+          <w:szCs w:val="24"/>
+        </w:rPr>
+        <w:t xml:space="preserve"> covers this; in the US, the FTC's </w:t>
+      </w:r>
+      <w:hyperlink w:history="1" r:id="rId-xxwbmtv9dpwce_j7dpd7">
+        <w:r>
+          <w:rPr>
+            <w:rStyle w:val="Hyperlink"/>
+            <w:rFonts w:ascii="Calibri" w:cs="Calibri" w:eastAsia="Calibri" w:hAnsi="Calibri"/>
+            <w:color w:val="0563C1"/>
+            <w:sz w:val="24"/>
+            <w:szCs w:val="24"/>
+            <w:u w:val="single"/>
+          </w:rPr>
+          <w:t xml:space="preserve">Disclosures 101</w:t>
+        </w:r>
+      </w:hyperlink>
+      <w:r>
+        <w:rPr>
+          <w:rFonts w:ascii="Calibri" w:cs="Calibri" w:eastAsia="Calibri" w:hAnsi="Calibri"/>
+          <w:color w:val="333333"/>
+          <w:sz w:val="24"/>
+          <w:szCs w:val="24"/>
+        </w:rPr>
+        <w:t xml:space="preserve"> says the same applies to free or discounted products. Put the label, such as "Ad", at the start of the caption where people can't miss it, and use Instagram's paid partnership label as well, not instead.</w:t>
       </w:r>
     </w:p>
     <w:p>

</xml_diff>

<commit_message>
Use dark featured images for cluster 2 articles
Co-Authored-By: Claude Opus 5.5 <noreply@anthropic.com>
Claude-Session: https://claude.ai/code/session_01GQXcnZLn4f9MkUS7SEqp5J
</commit_message>
<xml_diff>
--- a/blog-content/How-to-Write-Instagram-Captions-for-Business.docx
+++ b/blog-content/How-to-Write-Instagram-Captions-for-Business.docx
@@ -153,7 +153,7 @@
         </w:rPr>
         <w:t xml:space="preserve">This guide gives you a simple method you can use for every post, templates for each business goal, examples for different types of business, and a way to check whether your captions are working. If you're new to social media marketing as a whole, start with our </w:t>
       </w:r>
-      <w:hyperlink w:history="1" r:id="rId5vq-zogor8hguasvhquzp">
+      <w:hyperlink w:history="1" r:id="rId7cgm8hzxskv_1csya1_es">
         <w:r>
           <w:rPr>
             <w:rStyle w:val="Hyperlink"/>
@@ -1215,7 +1215,7 @@
         </w:rPr>
         <w:t xml:space="preserve"> Instagram now limits posts and Reels to </w:t>
       </w:r>
-      <w:hyperlink w:history="1" r:id="rIdwt17nsuzp4rvslhtcowzl">
+      <w:hyperlink w:history="1" r:id="rIdwn6b59pqpg9sz6vqw2bvo">
         <w:r>
           <w:rPr>
             <w:rStyle w:val="Hyperlink"/>
@@ -1237,7 +1237,7 @@
         </w:rPr>
         <w:t xml:space="preserve">, so pick ones that describe the post accurately. Our </w:t>
       </w:r>
-      <w:hyperlink w:history="1" r:id="rIdqxm_yv2_pze17eyiwbkv-">
+      <w:hyperlink w:history="1" r:id="rIdbskfsx7cdlncrf0fkb3zg">
         <w:r>
           <w:rPr>
             <w:rStyle w:val="Hyperlink"/>
@@ -1661,7 +1661,7 @@
         </w:rPr>
         <w:t xml:space="preserve">As long as the post needs, up to Instagram's limit of 2,200 characters, which Meta lists in its </w:t>
       </w:r>
-      <w:hyperlink w:history="1" r:id="rIdmlgnio2ncjmqldkdjhgif">
+      <w:hyperlink w:history="1" r:id="rIdnstwhrwiwd2xfom3qilsw">
         <w:r>
           <w:rPr>
             <w:rStyle w:val="Hyperlink"/>
@@ -2692,7 +2692,7 @@
         </w:rPr>
         <w:t xml:space="preserve">Use the words your customers type when they search. Instagram says its search tries to match what people type with usernames, bios, captions, hashtags and places, as </w:t>
       </w:r>
-      <w:hyperlink w:history="1" r:id="rId0cf8rginbabrljp_743kv">
+      <w:hyperlink w:history="1" r:id="rIdfqjsw5ybox4wyc54fh2sr">
         <w:r>
           <w:rPr>
             <w:rStyle w:val="Hyperlink"/>
@@ -2728,7 +2728,7 @@
         </w:rPr>
         <w:t xml:space="preserve">Captions can also reach people outside the app. Since July 2025, public posts from Instagram business and creator accounts can appear in Google and Bing results, </w:t>
       </w:r>
-      <w:hyperlink w:history="1" r:id="rIdb9p0ryhmpzxwgvdyrwn5e">
+      <w:hyperlink w:history="1" r:id="rId8c6texibocop2qjqdqasb">
         <w:r>
           <w:rPr>
             <w:rStyle w:val="Hyperlink"/>
@@ -2851,7 +2851,7 @@
         </w:rPr>
         <w:t xml:space="preserve"> for images. Instagram lets you add your own description in the post's advanced settings before or after posting, as its </w:t>
       </w:r>
-      <w:hyperlink w:history="1" r:id="rIde9phuotomz-zs3nevjdms">
+      <w:hyperlink w:history="1" r:id="rId_wbofifxsxniwvzomgn1h">
         <w:r>
           <w:rPr>
             <w:rStyle w:val="Hyperlink"/>
@@ -3049,7 +3049,7 @@
         </w:rPr>
         <w:t xml:space="preserve"> AI is useful when you're stuck on a hook or need five versions of a call to action. Our free </w:t>
       </w:r>
-      <w:hyperlink w:history="1" r:id="rIdxsbur1ttkisg7jjz8w915">
+      <w:hyperlink w:history="1" r:id="rIdotutizziir4h_y_s4ritz">
         <w:r>
           <w:rPr>
             <w:rStyle w:val="Hyperlink"/>
@@ -3071,7 +3071,7 @@
         </w:rPr>
         <w:t xml:space="preserve"> gives you drafts to start from. Then add the details only you know: your prices, your customers' words, your real results. The editing steps in </w:t>
       </w:r>
-      <w:hyperlink w:history="1" r:id="rIdxts32hqcf0hr0gzuwib_x">
+      <w:hyperlink w:history="1" r:id="rId27us6td8abfe9wkbd32u5">
         <w:r>
           <w:rPr>
             <w:rStyle w:val="Hyperlink"/>
@@ -3535,7 +3535,7 @@
         </w:rPr>
         <w:t xml:space="preserve">Yes, if a post promotes something you were paid for, gifted or have a business link to, it must be clearly labelled as an ad. In the UK, the ASA and CMA's </w:t>
       </w:r>
-      <w:hyperlink w:history="1" r:id="rId70vjq_1ykof6jkngvtgdv">
+      <w:hyperlink w:history="1" r:id="rId_qynnytkfgmuiy0ayvmbk">
         <w:r>
           <w:rPr>
             <w:rStyle w:val="Hyperlink"/>
@@ -3557,7 +3557,7 @@
         </w:rPr>
         <w:t xml:space="preserve"> covers this; in the US, the FTC's </w:t>
       </w:r>
-      <w:hyperlink w:history="1" r:id="rId-xxwbmtv9dpwce_j7dpd7">
+      <w:hyperlink w:history="1" r:id="rIdej8a6w5rqntw58ruhylhk">
         <w:r>
           <w:rPr>
             <w:rStyle w:val="Hyperlink"/>

</xml_diff>